<commit_message>
Generated clean, empty body Word letterhead template using Sample.png as background watermark
</commit_message>
<xml_diff>
--- a/sundar_innovations_letterhead.docx
+++ b/sundar_innovations_letterhead.docx
@@ -2,123 +2,6 @@
 <file path=word/document.xml><?xml version="1.0" encoding="utf-8"?>
 <w:document xmlns:wpc="http://schemas.microsoft.com/office/word/2010/wordprocessingCanvas" xmlns:mo="http://schemas.microsoft.com/office/mac/office/2008/main" xmlns:mc="http://schemas.openxmlformats.org/markup-compatibility/2006" xmlns:mv="urn:schemas-microsoft-com:mac:vml" xmlns:o="urn:schemas-microsoft-com:office:office" xmlns:r="http://schemas.openxmlformats.org/officeDocument/2006/relationships" xmlns:m="http://schemas.openxmlformats.org/officeDocument/2006/math" xmlns:v="urn:schemas-microsoft-com:vml" xmlns:wp14="http://schemas.microsoft.com/office/word/2010/wordprocessingDrawing" xmlns:wp="http://schemas.openxmlformats.org/drawingml/2006/wordprocessingDrawing" xmlns:w10="urn:schemas-microsoft-com:office:word" xmlns:w="http://schemas.openxmlformats.org/wordprocessingml/2006/main" xmlns:w14="http://schemas.microsoft.com/office/word/2010/wordml" xmlns:wpg="http://schemas.microsoft.com/office/word/2010/wordprocessingGroup" xmlns:wpi="http://schemas.microsoft.com/office/word/2010/wordprocessingInk" xmlns:wne="http://schemas.microsoft.com/office/word/2006/wordml" xmlns:wps="http://schemas.microsoft.com/office/word/2010/wordprocessingShape" mc:Ignorable="w14 wp14">
   <w:body>
-    <w:p>
-      <w:pPr>
-        <w:spacing w:before="240" w:after="400"/>
-      </w:pPr>
-      <w:r>
-        <w:rPr>
-          <w:rFonts w:ascii="Inter" w:hAnsi="Inter"/>
-          <w:sz w:val="19"/>
-        </w:rPr>
-        <w:t>Ref No: SI/CAD/2026/096</w:t>
-        <w:tab/>
-        <w:tab/>
-        <w:tab/>
-        <w:tab/>
-        <w:tab/>
-        <w:tab/>
-        <w:tab/>
-      </w:r>
-      <w:r>
-        <w:rPr>
-          <w:rFonts w:ascii="Inter" w:hAnsi="Inter"/>
-          <w:sz w:val="19"/>
-        </w:rPr>
-        <w:t>Date: July 9, 2026</w:t>
-      </w:r>
-    </w:p>
-    <w:p>
-      <w:pPr>
-        <w:spacing w:after="300"/>
-      </w:pPr>
-      <w:r>
-        <w:rPr>
-          <w:rFonts w:ascii="Inter" w:hAnsi="Inter"/>
-          <w:b/>
-          <w:sz w:val="19"/>
-        </w:rPr>
-        <w:t>To,</w:t>
-        <w:br/>
-        <w:t>The Procurement Committee,</w:t>
-        <w:br/>
-        <w:t>Science &amp; Technology R&amp;D Division,</w:t>
-        <w:br/>
-        <w:t>Hyderabad, India</w:t>
-      </w:r>
-    </w:p>
-    <w:p>
-      <w:pPr>
-        <w:spacing w:after="400"/>
-      </w:pPr>
-      <w:r>
-        <w:rPr>
-          <w:rFonts w:ascii="Inter" w:hAnsi="Inter"/>
-          <w:b/>
-          <w:sz w:val="20"/>
-        </w:rPr>
-        <w:t xml:space="preserve">Subject: </w:t>
-      </w:r>
-      <w:r>
-        <w:rPr>
-          <w:rFonts w:ascii="Inter" w:hAnsi="Inter"/>
-          <w:b/>
-          <w:sz w:val="20"/>
-          <w:u w:val="single"/>
-        </w:rPr>
-        <w:t>Official Deployment of Carbon Antidote Plus® Catalyst Trial</w:t>
-      </w:r>
-    </w:p>
-    <w:p>
-      <w:pPr>
-        <w:spacing w:after="240" w:line="300" w:lineRule="auto"/>
-      </w:pPr>
-      <w:r>
-        <w:rPr>
-          <w:rFonts w:ascii="Inter" w:hAnsi="Inter"/>
-          <w:sz w:val="19"/>
-        </w:rPr>
-        <w:t>We are pleased to submit this official request for initiating state trials of Sundar Carbon Antidote Plus® fuel catalytic modifier. Built for extreme operational conditions and designed to treat standard gasoline and ethanol blend formulations, our catalyst boosts fuel efficiency by exactly 30% while reducing greenhouse gas emissions.</w:t>
-      </w:r>
-    </w:p>
-    <w:p>
-      <w:pPr>
-        <w:spacing w:after="600" w:line="300" w:lineRule="auto"/>
-      </w:pPr>
-      <w:r>
-        <w:rPr>
-          <w:rFonts w:ascii="Inter" w:hAnsi="Inter"/>
-          <w:sz w:val="19"/>
-        </w:rPr>
-        <w:t>Please let us know if we can schedule an introductory technical brief with your lab directors to coordinate baseline tests next week. Thank you for your continued support in building modern, green engineering solutions.</w:t>
-      </w:r>
-    </w:p>
-    <w:p>
-      <w:pPr>
-        <w:spacing w:after="900"/>
-      </w:pPr>
-      <w:r>
-        <w:rPr>
-          <w:rFonts w:ascii="Inter" w:hAnsi="Inter"/>
-          <w:sz w:val="19"/>
-        </w:rPr>
-        <w:t>Sincerely,</w:t>
-        <w:br/>
-        <w:t>For Sundar Innovations Private Limited</w:t>
-      </w:r>
-    </w:p>
-    <w:p>
-      <w:r>
-        <w:rPr>
-          <w:rFonts w:ascii="Inter" w:hAnsi="Inter"/>
-          <w:b/>
-          <w:sz w:val="19"/>
-        </w:rPr>
-        <w:t>Authorized Signatory</w:t>
-        <w:br/>
-        <w:t>Director of Operations</w:t>
-      </w:r>
-    </w:p>
     <w:sectPr>
       <w:headerReference w:type="default" r:id="rId9"/>
       <w:pgSz w:w="11909" w:h="16834"/>
@@ -135,7 +18,6 @@
   <w:p>
     <w:pPr>
       <w:pStyle w:val="Header"/>
-      <w:jc w:val="left"/>
     </w:pPr>
     <w:r>
       <w:drawing>
@@ -150,13 +32,13 @@
           <wp:extent cx="7562088" cy="10689336"/>
           <wp:effectExtent l="0" t="0" r="0" b="0"/>
           <wp:wrapNone/>
-          <wp:docPr id="1" name="Letterhead Background"/>
+          <wp:docPr id="1" name="Letterhead Background Canvas"/>
           <wp:cNvGraphicFramePr/>
           <a:graphic xmlns:a="http://schemas.openxmlformats.org/drawingml/2006/main" xmlns:pic="http://schemas.openxmlformats.org/drawingml/2006/picture">
             <a:graphicData uri="http://schemas.openxmlformats.org/drawingml/2006/picture">
               <pic:pic>
                 <pic:nvPicPr>
-                  <pic:cNvPr id="0" name="docx_background.png"/>
+                  <pic:cNvPr id="0" name="Sample.png"/>
                   <pic:cNvPicPr/>
                 </pic:nvPicPr>
                 <pic:blipFill>
@@ -179,201 +61,6 @@
       </w:drawing>
     </w:r>
   </w:p>
-  <w:tbl>
-    <w:tblPr>
-      <w:tblW w:type="auto" w:w="0"/>
-      <w:jc w:val="center"/>
-      <w:tblLayout w:type="fixed"/>
-      <w:tblLook w:firstColumn="1" w:firstRow="1" w:lastColumn="0" w:lastRow="0" w:noHBand="0" w:noVBand="1" w:val="04A0"/>
-    </w:tblPr>
-    <w:tblGrid>
-      <w:gridCol w:w="4608"/>
-      <w:gridCol w:w="5026"/>
-    </w:tblGrid>
-    <w:tr>
-      <w:tc>
-        <w:tcPr>
-          <w:tcW w:type="dxa" w:w="4608"/>
-          <w:tcBorders>
-            <w:right w:val="single" w:sz="6" w:space="0" w:color="D0D5E0"/>
-          </w:tcBorders>
-        </w:tcPr>
-        <w:p>
-          <w:pPr>
-            <w:spacing w:before="0" w:after="40"/>
-            <w:jc w:val="left"/>
-          </w:pPr>
-          <w:r>
-            <w:drawing>
-              <wp:inline xmlns:a="http://schemas.openxmlformats.org/drawingml/2006/main" xmlns:pic="http://schemas.openxmlformats.org/drawingml/2006/picture">
-                <wp:extent cx="621792" cy="253691"/>
-                <wp:docPr id="2" name="Picture 2"/>
-                <wp:cNvGraphicFramePr>
-                  <a:graphicFrameLocks noChangeAspect="1"/>
-                </wp:cNvGraphicFramePr>
-                <a:graphic>
-                  <a:graphicData uri="http://schemas.openxmlformats.org/drawingml/2006/picture">
-                    <pic:pic>
-                      <pic:nvPicPr>
-                        <pic:cNvPr id="0" name="logo_transparent.png"/>
-                        <pic:cNvPicPr/>
-                      </pic:nvPicPr>
-                      <pic:blipFill>
-                        <a:blip r:embed="rId2"/>
-                        <a:stretch>
-                          <a:fillRect/>
-                        </a:stretch>
-                      </pic:blipFill>
-                      <pic:spPr>
-                        <a:xfrm>
-                          <a:off x="0" y="0"/>
-                          <a:ext cx="621792" cy="253691"/>
-                        </a:xfrm>
-                        <a:prstGeom prst="rect"/>
-                      </pic:spPr>
-                    </pic:pic>
-                  </a:graphicData>
-                </a:graphic>
-              </wp:inline>
-            </w:drawing>
-          </w:r>
-          <w:r>
-            <w:t xml:space="preserve">   </w:t>
-          </w:r>
-        </w:p>
-        <w:p>
-          <w:pPr>
-            <w:spacing w:before="80" w:after="40"/>
-          </w:pPr>
-          <w:r>
-            <w:rPr>
-              <w:rFonts w:ascii="Outfit" w:hAnsi="Outfit"/>
-              <w:b/>
-              <w:color w:val="0F111A"/>
-              <w:sz w:val="28"/>
-            </w:rPr>
-            <w:t>SUNDAR INNOVATIONS</w:t>
-          </w:r>
-        </w:p>
-        <w:p>
-          <w:pPr>
-            <w:spacing w:before="40" w:after="0"/>
-          </w:pPr>
-          <w:r>
-            <w:rPr>
-              <w:rFonts w:ascii="Outfit" w:hAnsi="Outfit"/>
-              <w:b/>
-              <w:color w:val="6E7582"/>
-              <w:sz w:val="14"/>
-            </w:rPr>
-            <w:t>INNOVATE  •  ENGINEER  •  EMPOWER</w:t>
-          </w:r>
-        </w:p>
-      </w:tc>
-      <w:tc>
-        <w:tcPr>
-          <w:tcW w:type="dxa" w:w="5026"/>
-          <w:tcMar>
-            <w:left w:w="180" w:type="dxa"/>
-          </w:tcMar>
-        </w:tcPr>
-        <w:p>
-          <w:pPr>
-            <w:spacing w:before="0" w:after="80"/>
-            <w:jc w:val="right"/>
-          </w:pPr>
-          <w:r>
-            <w:rPr>
-              <w:rFonts w:ascii="Outfit" w:hAnsi="Outfit"/>
-              <w:b/>
-              <w:color w:val="0B4EBD"/>
-              <w:sz w:val="24"/>
-            </w:rPr>
-            <w:t>Sundar innovations Private Limited</w:t>
-          </w:r>
-        </w:p>
-        <w:p>
-          <w:pPr>
-            <w:spacing w:before="0" w:after="0" w:line="288" w:lineRule="auto"/>
-            <w:jc w:val="right"/>
-          </w:pPr>
-          <w:r>
-            <w:rPr>
-              <w:rFonts w:ascii="Inter" w:hAnsi="Inter"/>
-              <w:b/>
-              <w:color w:val="1F2229"/>
-              <w:sz w:val="17"/>
-            </w:rPr>
-            <w:t xml:space="preserve">Email: </w:t>
-          </w:r>
-          <w:r>
-            <w:rPr>
-              <w:rFonts w:ascii="Inter" w:hAnsi="Inter"/>
-              <w:color w:val="6E7582"/>
-              <w:sz w:val="17"/>
-            </w:rPr>
-            <w:t>info@sundarinnovations.com</w:t>
-            <w:br/>
-          </w:r>
-          <w:r>
-            <w:rPr>
-              <w:rFonts w:ascii="Inter" w:hAnsi="Inter"/>
-              <w:b/>
-              <w:color w:val="1F2229"/>
-              <w:sz w:val="17"/>
-            </w:rPr>
-            <w:t xml:space="preserve">Web: </w:t>
-          </w:r>
-          <w:r>
-            <w:rPr>
-              <w:rFonts w:ascii="Inter" w:hAnsi="Inter"/>
-              <w:color w:val="6E7582"/>
-              <w:sz w:val="17"/>
-            </w:rPr>
-            <w:t>www.sundarinnovations.com</w:t>
-            <w:br/>
-          </w:r>
-          <w:r>
-            <w:rPr>
-              <w:rFonts w:ascii="Inter" w:hAnsi="Inter"/>
-              <w:b/>
-              <w:color w:val="1F2229"/>
-              <w:sz w:val="17"/>
-            </w:rPr>
-            <w:t xml:space="preserve">Phone: </w:t>
-          </w:r>
-          <w:r>
-            <w:rPr>
-              <w:rFonts w:ascii="Inter" w:hAnsi="Inter"/>
-              <w:color w:val="6E7582"/>
-              <w:sz w:val="17"/>
-            </w:rPr>
-            <w:t>+91 94928 28882</w:t>
-            <w:br/>
-          </w:r>
-          <w:r>
-            <w:rPr>
-              <w:rFonts w:ascii="Inter" w:hAnsi="Inter"/>
-              <w:b/>
-              <w:color w:val="1F2229"/>
-              <w:sz w:val="17"/>
-            </w:rPr>
-            <w:t xml:space="preserve">Address: </w:t>
-          </w:r>
-          <w:r>
-            <w:rPr>
-              <w:rFonts w:ascii="Inter" w:hAnsi="Inter"/>
-              <w:color w:val="6E7582"/>
-              <w:sz w:val="17"/>
-            </w:rPr>
-            <w:t>H.No. 4-48, Science Tech Park,</w:t>
-            <w:br/>
-            <w:t>Gachibowli, Hyderabad, TS, India - 500032</w:t>
-          </w:r>
-        </w:p>
-      </w:tc>
-    </w:tr>
-  </w:tbl>
 </w:hdr>
 </file>
 

</xml_diff>

<commit_message>
Compiled new custom letterhead design with globe footer and optimized margins into Word docx
</commit_message>
<xml_diff>
--- a/sundar_innovations_letterhead.docx
+++ b/sundar_innovations_letterhead.docx
@@ -5,7 +5,7 @@
     <w:sectPr>
       <w:headerReference w:type="default" r:id="rId9"/>
       <w:pgSz w:w="11909" w:h="16834"/>
-      <w:pgMar w:top="3312" w:right="1152" w:bottom="1728" w:left="1152" w:header="720" w:footer="720" w:gutter="0"/>
+      <w:pgMar w:top="3312" w:right="1152" w:bottom="2160" w:left="1152" w:header="720" w:footer="720" w:gutter="0"/>
       <w:cols w:space="720"/>
       <w:docGrid w:linePitch="360"/>
     </w:sectPr>
@@ -32,13 +32,13 @@
           <wp:extent cx="7562088" cy="10689336"/>
           <wp:effectExtent l="0" t="0" r="0" b="0"/>
           <wp:wrapNone/>
-          <wp:docPr id="1" name="Letterhead Background Canvas"/>
+          <wp:docPr id="1" name="New Letterhead Background"/>
           <wp:cNvGraphicFramePr/>
           <a:graphic xmlns:a="http://schemas.openxmlformats.org/drawingml/2006/main" xmlns:pic="http://schemas.openxmlformats.org/drawingml/2006/picture">
             <a:graphicData uri="http://schemas.openxmlformats.org/drawingml/2006/picture">
               <pic:pic>
                 <pic:nvPicPr>
-                  <pic:cNvPr id="0" name="Sample_enhanced.png"/>
+                  <pic:cNvPr id="0" name="sundar_innovations_letterhead_enhanced.png"/>
                   <pic:cNvPicPr/>
                 </pic:nvPicPr>
                 <pic:blipFill>

</xml_diff>

<commit_message>
Reduced header vertical occupancy by cropping blank vertical space and shifting header bar up to reclaim page writing space
</commit_message>
<xml_diff>
--- a/sundar_innovations_letterhead.docx
+++ b/sundar_innovations_letterhead.docx
@@ -5,7 +5,7 @@
     <w:sectPr>
       <w:headerReference w:type="default" r:id="rId9"/>
       <w:pgSz w:w="11909" w:h="16834"/>
-      <w:pgMar w:top="3312" w:right="1152" w:bottom="2160" w:left="1152" w:header="720" w:footer="720" w:gutter="0"/>
+      <w:pgMar w:top="2592" w:right="1152" w:bottom="2160" w:left="1152" w:header="720" w:footer="720" w:gutter="0"/>
       <w:cols w:space="720"/>
       <w:docGrid w:linePitch="360"/>
     </w:sectPr>
@@ -32,7 +32,7 @@
           <wp:extent cx="7562088" cy="10689336"/>
           <wp:effectExtent l="0" t="0" r="0" b="0"/>
           <wp:wrapNone/>
-          <wp:docPr id="1" name="New Letterhead Background"/>
+          <wp:docPr id="1" name="New Shrunk Letterhead Background"/>
           <wp:cNvGraphicFramePr/>
           <a:graphic xmlns:a="http://schemas.openxmlformats.org/drawingml/2006/main" xmlns:pic="http://schemas.openxmlformats.org/drawingml/2006/picture">
             <a:graphicData uri="http://schemas.openxmlformats.org/drawingml/2006/picture">

</xml_diff>